<commit_message>
Update CV content: new email, profile summary, reorganized projects, updated skills & certs
</commit_message>
<xml_diff>
--- a/cv-harvard-es.docx
+++ b/cv-harvard-es.docx
@@ -4,7 +4,11 @@
   <w:body>
     <w:p>
       <w:pPr>
+        <w:spacing w:after="40"/>
         <w:jc w:val="center"/>
+        <w:pBdr>
+          <w:bottom w:val="single" w:sz="16" w:space="1" w:color="1A1A1A"/>
+        </w:pBdr>
       </w:pPr>
       <w:r>
         <w:rPr>
@@ -12,13 +16,14 @@
           <w:b/>
           <w:i w:val="0"/>
           <w:sz w:val="36"/>
+          <w:rFonts w:ascii="Times New Roman" w:hAnsi="Times New Roman" w:cs="Times New Roman"/>
         </w:rPr>
         <w:t>ANTONIO CORTAZAR JIMENEZ</w:t>
       </w:r>
     </w:p>
     <w:p>
       <w:pPr>
-        <w:spacing w:after="20"/>
+        <w:spacing w:after="40"/>
         <w:jc w:val="center"/>
       </w:pPr>
       <w:r>
@@ -28,18 +33,10 @@
           <w:i w:val="0"/>
           <w:color w:val="333333"/>
           <w:sz w:val="19"/>
+          <w:rFonts w:ascii="Times New Roman" w:hAnsi="Times New Roman" w:cs="Times New Roman"/>
         </w:rPr>
-        <w:t>Cancún, México  |  81 3511 2848  |  Antony_cj12@outlook.com</w:t>
+        <w:t>Cancún, México | 81 3511 2848 | hola@antoniocortazar.dev</w:t>
       </w:r>
-    </w:p>
-    <w:p>
-      <w:pPr>
-        <w:spacing w:after="120"/>
-        <w:jc w:val="center"/>
-        <w:pBdr>
-          <w:bottom w:val="single" w:sz="12" w:space="1" w:color="1A1A1A"/>
-        </w:pBdr>
-      </w:pPr>
       <w:r>
         <w:rPr>
           <w:rFonts w:ascii="Times New Roman" w:hAnsi="Times New Roman"/>
@@ -47,16 +44,18 @@
           <w:i w:val="0"/>
           <w:color w:val="333333"/>
           <w:sz w:val="19"/>
+          <w:rFonts w:ascii="Times New Roman" w:hAnsi="Times New Roman" w:cs="Times New Roman"/>
         </w:rPr>
-        <w:t>linkedin.com/in/antoniocortazar  |  antoniocortazar.dev  |  github.com/Antony-potato</w:t>
+        <w:br/>
+        <w:t>linkedin.com/in/antoniocortazar | antoniocortazar.dev | github.com/Antony-potato</w:t>
       </w:r>
     </w:p>
     <w:p>
       <w:pPr>
-        <w:spacing w:before="200" w:after="60"/>
         <w:pBdr>
           <w:bottom w:val="single" w:sz="12" w:space="1" w:color="1A1A1A"/>
         </w:pBdr>
+        <w:spacing w:before="240" w:after="80"/>
       </w:pPr>
       <w:r>
         <w:rPr>
@@ -64,13 +63,47 @@
           <w:b/>
           <w:i w:val="0"/>
           <w:sz w:val="22"/>
+          <w:rFonts w:ascii="Times New Roman" w:hAnsi="Times New Roman" w:cs="Times New Roman"/>
+        </w:rPr>
+        <w:t>PERFIL PROFESIONAL</w:t>
+      </w:r>
+    </w:p>
+    <w:p>
+      <w:pPr>
+        <w:spacing w:after="80"/>
+      </w:pPr>
+      <w:r>
+        <w:rPr>
+          <w:rFonts w:ascii="Times New Roman" w:hAnsi="Times New Roman"/>
+          <w:b w:val="0"/>
+          <w:i w:val="0"/>
+          <w:sz w:val="20"/>
+          <w:rFonts w:ascii="Times New Roman" w:hAnsi="Times New Roman" w:cs="Times New Roman"/>
+        </w:rPr>
+        <w:t>Desarrollador Full Stack y estudiante de Ingeniería en Desarrollo de Software con nivel de inglés C1. Especializado en construir soluciones web escalables e interfaces inmersivas utilizando tecnologías modernas como React, Next.js y Astro, integradas con infraestructuras en la nube (AWS, Docker). Orientado a resultados y comprometido con la entrega de código eficiente. Combino una sólida base técnica con excelentes habilidades interpersonales para colaborar en equipos multidisciplinarios, digitalizar procesos corporativos y crear herramientas tecnológicas que aporten valor real al negocio y a la experiencia del usuario.</w:t>
+      </w:r>
+    </w:p>
+    <w:p>
+      <w:pPr>
+        <w:pBdr>
+          <w:bottom w:val="single" w:sz="12" w:space="1" w:color="1A1A1A"/>
+        </w:pBdr>
+        <w:spacing w:before="240" w:after="80"/>
+      </w:pPr>
+      <w:r>
+        <w:rPr>
+          <w:rFonts w:ascii="Times New Roman" w:hAnsi="Times New Roman"/>
+          <w:b/>
+          <w:i w:val="0"/>
+          <w:sz w:val="22"/>
+          <w:rFonts w:ascii="Times New Roman" w:hAnsi="Times New Roman" w:cs="Times New Roman"/>
         </w:rPr>
         <w:t>EDUCACIÓN</w:t>
       </w:r>
     </w:p>
     <w:p>
       <w:pPr>
-        <w:spacing w:before="120" w:after="0"/>
+        <w:spacing w:before="80" w:after="0"/>
       </w:pPr>
       <w:r>
         <w:rPr>
@@ -78,6 +111,7 @@
           <w:b/>
           <w:i w:val="0"/>
           <w:sz w:val="21"/>
+          <w:rFonts w:ascii="Times New Roman" w:hAnsi="Times New Roman" w:cs="Times New Roman"/>
         </w:rPr>
         <w:t>Universidad Tecmilenio</w:t>
       </w:r>
@@ -88,6 +122,7 @@
           <w:i/>
           <w:color w:val="555555"/>
           <w:sz w:val="19"/>
+          <w:rFonts w:ascii="Times New Roman" w:hAnsi="Times New Roman" w:cs="Times New Roman"/>
         </w:rPr>
         <w:t xml:space="preserve"> — Cancún, México</w:t>
       </w:r>
@@ -98,14 +133,15 @@
           <w:i/>
           <w:color w:val="555555"/>
           <w:sz w:val="19"/>
+          <w:rFonts w:ascii="Times New Roman" w:hAnsi="Times New Roman" w:cs="Times New Roman"/>
         </w:rPr>
         <w:tab/>
-        <w:t>2023 – Actualidad</w:t>
+        <w:t>2023 – Esperado: Mayo 2027</w:t>
       </w:r>
     </w:p>
     <w:p>
       <w:pPr>
-        <w:spacing w:after="20"/>
+        <w:spacing w:after="40"/>
       </w:pPr>
       <w:r>
         <w:rPr>
@@ -113,40 +149,34 @@
           <w:b w:val="0"/>
           <w:i/>
           <w:sz w:val="20"/>
+          <w:rFonts w:ascii="Times New Roman" w:hAnsi="Times New Roman" w:cs="Times New Roman"/>
         </w:rPr>
         <w:t>Ingeniería en Desarrollo de Software</w:t>
       </w:r>
     </w:p>
     <w:p>
       <w:pPr>
-        <w:spacing w:after="20" w:before="0"/>
-        <w:ind w:left="360" w:hanging="216"/>
+        <w:pStyle w:val="ListBullet"/>
+        <w:spacing w:before="20" w:after="20"/>
+        <w:ind w:left="360"/>
       </w:pPr>
       <w:r>
         <w:rPr>
           <w:rFonts w:ascii="Times New Roman" w:hAnsi="Times New Roman"/>
           <w:b w:val="0"/>
           <w:i w:val="0"/>
-          <w:sz w:val="18"/>
+          <w:sz w:val="20"/>
+          <w:rFonts w:ascii="Times New Roman" w:hAnsi="Times New Roman" w:cs="Times New Roman"/>
         </w:rPr>
-        <w:t xml:space="preserve">• </w:t>
-      </w:r>
-      <w:r>
-        <w:rPr>
-          <w:rFonts w:ascii="Times New Roman" w:hAnsi="Times New Roman"/>
-          <w:b w:val="0"/>
-          <w:i w:val="0"/>
-          <w:sz w:val="19"/>
-        </w:rPr>
-        <w:t>Materias relevantes: Estructuras de Datos, Programación Orientada a Objetos (Java), Desarrollo Web Full Stack, Bases de Datos Relacionales, Infraestructura como Código</w:t>
+        <w:t>Materias relevantes: Estructuras de Datos, Programación Orientada a Objetos (Java), Desarrollo Web Full Stack, Bases de Datos Relacionales, Infraestructura como Código.</w:t>
       </w:r>
     </w:p>
     <w:p>
       <w:pPr>
-        <w:spacing w:before="200" w:after="60"/>
         <w:pBdr>
           <w:bottom w:val="single" w:sz="12" w:space="1" w:color="1A1A1A"/>
         </w:pBdr>
+        <w:spacing w:before="240" w:after="80"/>
       </w:pPr>
       <w:r>
         <w:rPr>
@@ -154,13 +184,14 @@
           <w:b/>
           <w:i w:val="0"/>
           <w:sz w:val="22"/>
+          <w:rFonts w:ascii="Times New Roman" w:hAnsi="Times New Roman" w:cs="Times New Roman"/>
         </w:rPr>
         <w:t>EXPERIENCIA</w:t>
       </w:r>
     </w:p>
     <w:p>
       <w:pPr>
-        <w:spacing w:before="120" w:after="0"/>
+        <w:spacing w:before="80" w:after="0"/>
       </w:pPr>
       <w:r>
         <w:rPr>
@@ -168,6 +199,7 @@
           <w:b/>
           <w:i w:val="0"/>
           <w:sz w:val="21"/>
+          <w:rFonts w:ascii="Times New Roman" w:hAnsi="Times New Roman" w:cs="Times New Roman"/>
         </w:rPr>
         <w:t>Onix Living</w:t>
       </w:r>
@@ -178,6 +210,7 @@
           <w:i/>
           <w:color w:val="555555"/>
           <w:sz w:val="19"/>
+          <w:rFonts w:ascii="Times New Roman" w:hAnsi="Times New Roman" w:cs="Times New Roman"/>
         </w:rPr>
         <w:t xml:space="preserve"> — Auxiliar de TI y Desarrollo Web</w:t>
       </w:r>
@@ -188,6 +221,7 @@
           <w:i/>
           <w:color w:val="555555"/>
           <w:sz w:val="19"/>
+          <w:rFonts w:ascii="Times New Roman" w:hAnsi="Times New Roman" w:cs="Times New Roman"/>
         </w:rPr>
         <w:tab/>
         <w:t>Ago 2025 – Presente</w:t>
@@ -195,120 +229,85 @@
     </w:p>
     <w:p>
       <w:pPr>
-        <w:spacing w:after="20" w:before="0"/>
-        <w:ind w:left="360" w:hanging="216"/>
+        <w:pStyle w:val="ListBullet"/>
+        <w:spacing w:before="20" w:after="20"/>
+        <w:ind w:left="360"/>
       </w:pPr>
       <w:r>
         <w:rPr>
           <w:rFonts w:ascii="Times New Roman" w:hAnsi="Times New Roman"/>
           <w:b w:val="0"/>
           <w:i w:val="0"/>
-          <w:sz w:val="18"/>
+          <w:sz w:val="20"/>
+          <w:rFonts w:ascii="Times New Roman" w:hAnsi="Times New Roman" w:cs="Times New Roman"/>
         </w:rPr>
-        <w:t xml:space="preserve">• </w:t>
-      </w:r>
-      <w:r>
-        <w:rPr>
-          <w:rFonts w:ascii="Times New Roman" w:hAnsi="Times New Roman"/>
-          <w:b w:val="0"/>
-          <w:i w:val="0"/>
-          <w:sz w:val="19"/>
-        </w:rPr>
-        <w:t>Containericé y desplegué aplicaciones web internas usando Docker Compose en infraestructura propia, reduciendo tiempos de despliegue y mejorando la consistencia entre entornos.</w:t>
+        <w:t>Containericé y desplegué aplicaciones web internas mediante Docker Compose en AWS Lightsail, optimizando los tiempos de liberación y asegurando la consistencia entre entornos.</w:t>
       </w:r>
     </w:p>
     <w:p>
       <w:pPr>
-        <w:spacing w:after="20" w:before="0"/>
-        <w:ind w:left="360" w:hanging="216"/>
+        <w:pStyle w:val="ListBullet"/>
+        <w:spacing w:before="20" w:after="20"/>
+        <w:ind w:left="360"/>
       </w:pPr>
       <w:r>
         <w:rPr>
           <w:rFonts w:ascii="Times New Roman" w:hAnsi="Times New Roman"/>
           <w:b w:val="0"/>
           <w:i w:val="0"/>
-          <w:sz w:val="18"/>
+          <w:sz w:val="20"/>
+          <w:rFonts w:ascii="Times New Roman" w:hAnsi="Times New Roman" w:cs="Times New Roman"/>
         </w:rPr>
-        <w:t xml:space="preserve">• </w:t>
-      </w:r>
-      <w:r>
-        <w:rPr>
-          <w:rFonts w:ascii="Times New Roman" w:hAnsi="Times New Roman"/>
-          <w:b w:val="0"/>
-          <w:i w:val="0"/>
-          <w:sz w:val="19"/>
-        </w:rPr>
-        <w:t>Construí un dashboard interno de operaciones de TI con Next.js y Gridstack, proporcionando widgets drag-and-drop para monitoreo en tiempo real de estado de activos y tickets de soporte.</w:t>
+        <w:t>Construí un dashboard interno de operaciones de TI con Next.js y Gridstack, proporcionando widgets drag-and-drop para monitoreo en tiempo real del estado de activos y tickets de soporte.</w:t>
       </w:r>
     </w:p>
     <w:p>
       <w:pPr>
-        <w:spacing w:after="20" w:before="0"/>
-        <w:ind w:left="360" w:hanging="216"/>
+        <w:pStyle w:val="ListBullet"/>
+        <w:spacing w:before="20" w:after="20"/>
+        <w:ind w:left="360"/>
       </w:pPr>
       <w:r>
         <w:rPr>
           <w:rFonts w:ascii="Times New Roman" w:hAnsi="Times New Roman"/>
           <w:b w:val="0"/>
           <w:i w:val="0"/>
-          <w:sz w:val="18"/>
-        </w:rPr>
-        <w:t xml:space="preserve">• </w:t>
-      </w:r>
-      <w:r>
-        <w:rPr>
-          <w:rFonts w:ascii="Times New Roman" w:hAnsi="Times New Roman"/>
-          <w:b w:val="0"/>
-          <w:i w:val="0"/>
-          <w:sz w:val="19"/>
+          <w:sz w:val="20"/>
+          <w:rFonts w:ascii="Times New Roman" w:hAnsi="Times New Roman" w:cs="Times New Roman"/>
         </w:rPr>
         <w:t>Implementé el sistema de gestión de activos Snipe-IT para rastrear 100+ activos fijos; automaticé flujos de aprovisionamiento y baja con formularios web y dashboards operativos.</w:t>
       </w:r>
     </w:p>
     <w:p>
       <w:pPr>
-        <w:spacing w:after="20" w:before="0"/>
-        <w:ind w:left="360" w:hanging="216"/>
+        <w:pStyle w:val="ListBullet"/>
+        <w:spacing w:before="20" w:after="20"/>
+        <w:ind w:left="360"/>
       </w:pPr>
       <w:r>
         <w:rPr>
           <w:rFonts w:ascii="Times New Roman" w:hAnsi="Times New Roman"/>
           <w:b w:val="0"/>
           <w:i w:val="0"/>
-          <w:sz w:val="18"/>
-        </w:rPr>
-        <w:t xml:space="preserve">• </w:t>
-      </w:r>
-      <w:r>
-        <w:rPr>
-          <w:rFonts w:ascii="Times New Roman" w:hAnsi="Times New Roman"/>
-          <w:b w:val="0"/>
-          <w:i w:val="0"/>
-          <w:sz w:val="19"/>
+          <w:sz w:val="20"/>
+          <w:rFonts w:ascii="Times New Roman" w:hAnsi="Times New Roman" w:cs="Times New Roman"/>
         </w:rPr>
         <w:t>Desplegué aplicaciones web estáticas en AWS y gestioné almacenamiento de assets multimedia vía Amazon S3 para proyectos de la empresa.</w:t>
       </w:r>
     </w:p>
     <w:p>
       <w:pPr>
-        <w:spacing w:after="20" w:before="0"/>
-        <w:ind w:left="360" w:hanging="216"/>
+        <w:pStyle w:val="ListBullet"/>
+        <w:spacing w:before="20" w:after="20"/>
+        <w:ind w:left="360"/>
       </w:pPr>
       <w:r>
         <w:rPr>
           <w:rFonts w:ascii="Times New Roman" w:hAnsi="Times New Roman"/>
           <w:b w:val="0"/>
           <w:i w:val="0"/>
-          <w:sz w:val="18"/>
-        </w:rPr>
-        <w:t xml:space="preserve">• </w:t>
-      </w:r>
-      <w:r>
-        <w:rPr>
-          <w:rFonts w:ascii="Times New Roman" w:hAnsi="Times New Roman"/>
-          <w:b w:val="0"/>
-          <w:i w:val="0"/>
-          <w:sz w:val="19"/>
+          <w:sz w:val="20"/>
+          <w:rFonts w:ascii="Times New Roman" w:hAnsi="Times New Roman" w:cs="Times New Roman"/>
         </w:rPr>
         <w:t>Brindé soporte técnico Nivel 1 y 2 para hardware y software en infraestructura de oficina; capacité a 25+ empleados en herramientas de IA y flujos de automatización de Zoho One.</w:t>
       </w:r>
@@ -323,6 +322,7 @@
           <w:b/>
           <w:i w:val="0"/>
           <w:sz w:val="21"/>
+          <w:rFonts w:ascii="Times New Roman" w:hAnsi="Times New Roman" w:cs="Times New Roman"/>
         </w:rPr>
         <w:t>Office Depot</w:t>
       </w:r>
@@ -333,6 +333,7 @@
           <w:i/>
           <w:color w:val="555555"/>
           <w:sz w:val="19"/>
+          <w:rFonts w:ascii="Times New Roman" w:hAnsi="Times New Roman" w:cs="Times New Roman"/>
         </w:rPr>
         <w:t xml:space="preserve"> — Supervisor de Departamento de Tecnología</w:t>
       </w:r>
@@ -343,6 +344,7 @@
           <w:i/>
           <w:color w:val="555555"/>
           <w:sz w:val="19"/>
+          <w:rFonts w:ascii="Times New Roman" w:hAnsi="Times New Roman" w:cs="Times New Roman"/>
         </w:rPr>
         <w:tab/>
         <w:t>Jun 2024 – Ago 2025</w:t>
@@ -350,106 +352,78 @@
     </w:p>
     <w:p>
       <w:pPr>
-        <w:spacing w:after="20" w:before="0"/>
-        <w:ind w:left="360" w:hanging="216"/>
+        <w:pStyle w:val="ListBullet"/>
+        <w:spacing w:before="20" w:after="20"/>
+        <w:ind w:left="360"/>
       </w:pPr>
       <w:r>
         <w:rPr>
           <w:rFonts w:ascii="Times New Roman" w:hAnsi="Times New Roman"/>
           <w:b w:val="0"/>
           <w:i w:val="0"/>
-          <w:sz w:val="18"/>
-        </w:rPr>
-        <w:t xml:space="preserve">• </w:t>
-      </w:r>
-      <w:r>
-        <w:rPr>
-          <w:rFonts w:ascii="Times New Roman" w:hAnsi="Times New Roman"/>
-          <w:b w:val="0"/>
-          <w:i w:val="0"/>
-          <w:sz w:val="19"/>
+          <w:sz w:val="20"/>
+          <w:rFonts w:ascii="Times New Roman" w:hAnsi="Times New Roman" w:cs="Times New Roman"/>
         </w:rPr>
         <w:t>Lideré un equipo de 5 colaboradores en el departamento de tecnología, brindando capacitación y guía operativa diaria.</w:t>
       </w:r>
     </w:p>
     <w:p>
       <w:pPr>
-        <w:spacing w:after="20" w:before="0"/>
-        <w:ind w:left="360" w:hanging="216"/>
+        <w:pStyle w:val="ListBullet"/>
+        <w:spacing w:before="20" w:after="20"/>
+        <w:ind w:left="360"/>
       </w:pPr>
       <w:r>
         <w:rPr>
           <w:rFonts w:ascii="Times New Roman" w:hAnsi="Times New Roman"/>
           <w:b w:val="0"/>
           <w:i w:val="0"/>
-          <w:sz w:val="18"/>
-        </w:rPr>
-        <w:t xml:space="preserve">• </w:t>
-      </w:r>
-      <w:r>
-        <w:rPr>
-          <w:rFonts w:ascii="Times New Roman" w:hAnsi="Times New Roman"/>
-          <w:b w:val="0"/>
-          <w:i w:val="0"/>
-          <w:sz w:val="19"/>
+          <w:sz w:val="20"/>
+          <w:rFonts w:ascii="Times New Roman" w:hAnsi="Times New Roman" w:cs="Times New Roman"/>
         </w:rPr>
         <w:t>Impulsé ventas de garantías de productos tecnológicos y superé objetivos trimestrales de KPIs mediante consultas a clientes sobre hardware, software y electrónica.</w:t>
       </w:r>
     </w:p>
     <w:p>
       <w:pPr>
-        <w:spacing w:after="20" w:before="0"/>
-        <w:ind w:left="360" w:hanging="216"/>
+        <w:pStyle w:val="ListBullet"/>
+        <w:spacing w:before="20" w:after="20"/>
+        <w:ind w:left="360"/>
       </w:pPr>
       <w:r>
         <w:rPr>
           <w:rFonts w:ascii="Times New Roman" w:hAnsi="Times New Roman"/>
           <w:b w:val="0"/>
           <w:i w:val="0"/>
-          <w:sz w:val="18"/>
-        </w:rPr>
-        <w:t xml:space="preserve">• </w:t>
-      </w:r>
-      <w:r>
-        <w:rPr>
-          <w:rFonts w:ascii="Times New Roman" w:hAnsi="Times New Roman"/>
-          <w:b w:val="0"/>
-          <w:i w:val="0"/>
-          <w:sz w:val="19"/>
+          <w:sz w:val="20"/>
+          <w:rFonts w:ascii="Times New Roman" w:hAnsi="Times New Roman" w:cs="Times New Roman"/>
         </w:rPr>
         <w:t>Gestioné KPIs del departamento incluyendo metas de ventas de garantías, satisfacción del cliente y precisión de inventario.</w:t>
       </w:r>
     </w:p>
     <w:p>
       <w:pPr>
-        <w:spacing w:after="20" w:before="0"/>
-        <w:ind w:left="360" w:hanging="216"/>
+        <w:pStyle w:val="ListBullet"/>
+        <w:spacing w:before="20" w:after="20"/>
+        <w:ind w:left="360"/>
       </w:pPr>
       <w:r>
         <w:rPr>
           <w:rFonts w:ascii="Times New Roman" w:hAnsi="Times New Roman"/>
           <w:b w:val="0"/>
           <w:i w:val="0"/>
-          <w:sz w:val="18"/>
-        </w:rPr>
-        <w:t xml:space="preserve">• </w:t>
-      </w:r>
-      <w:r>
-        <w:rPr>
-          <w:rFonts w:ascii="Times New Roman" w:hAnsi="Times New Roman"/>
-          <w:b w:val="0"/>
-          <w:i w:val="0"/>
-          <w:sz w:val="19"/>
+          <w:sz w:val="20"/>
+          <w:rFonts w:ascii="Times New Roman" w:hAnsi="Times New Roman" w:cs="Times New Roman"/>
         </w:rPr>
         <w:t>Brindé resolución de problemas técnicos y demostraciones de productos a clientes.</w:t>
       </w:r>
     </w:p>
     <w:p>
       <w:pPr>
-        <w:spacing w:before="200" w:after="60"/>
         <w:pBdr>
           <w:bottom w:val="single" w:sz="12" w:space="1" w:color="1A1A1A"/>
         </w:pBdr>
+        <w:spacing w:before="240" w:after="80"/>
       </w:pPr>
       <w:r>
         <w:rPr>
@@ -457,8 +431,98 @@
           <w:b/>
           <w:i w:val="0"/>
           <w:sz w:val="22"/>
+          <w:rFonts w:ascii="Times New Roman" w:hAnsi="Times New Roman" w:cs="Times New Roman"/>
         </w:rPr>
         <w:t>PROYECTOS</w:t>
+      </w:r>
+    </w:p>
+    <w:p>
+      <w:pPr>
+        <w:spacing w:before="80" w:after="0"/>
+      </w:pPr>
+      <w:r>
+        <w:rPr>
+          <w:rFonts w:ascii="Times New Roman" w:hAnsi="Times New Roman"/>
+          <w:b/>
+          <w:i w:val="0"/>
+          <w:sz w:val="21"/>
+          <w:rFonts w:ascii="Times New Roman" w:hAnsi="Times New Roman" w:cs="Times New Roman"/>
+        </w:rPr>
+        <w:t>Koa Towers y Aldea Savia — Plataformas Inmobiliarias Interactivas</w:t>
+      </w:r>
+      <w:r>
+        <w:rPr>
+          <w:rFonts w:ascii="Times New Roman" w:hAnsi="Times New Roman"/>
+          <w:b w:val="0"/>
+          <w:i/>
+          <w:color w:val="555555"/>
+          <w:sz w:val="19"/>
+          <w:rFonts w:ascii="Times New Roman" w:hAnsi="Times New Roman" w:cs="Times New Roman"/>
+        </w:rPr>
+        <w:t xml:space="preserve"> — Onix Living</w:t>
+      </w:r>
+      <w:r>
+        <w:rPr>
+          <w:rFonts w:ascii="Times New Roman" w:hAnsi="Times New Roman"/>
+          <w:b w:val="0"/>
+          <w:i/>
+          <w:color w:val="555555"/>
+          <w:sz w:val="19"/>
+          <w:rFonts w:ascii="Times New Roman" w:hAnsi="Times New Roman" w:cs="Times New Roman"/>
+        </w:rPr>
+        <w:tab/>
+        <w:t>2025</w:t>
+      </w:r>
+    </w:p>
+    <w:p>
+      <w:pPr>
+        <w:pStyle w:val="ListBullet"/>
+        <w:spacing w:before="20" w:after="20"/>
+        <w:ind w:left="360"/>
+      </w:pPr>
+      <w:r>
+        <w:rPr>
+          <w:rFonts w:ascii="Times New Roman" w:hAnsi="Times New Roman"/>
+          <w:b w:val="0"/>
+          <w:i w:val="0"/>
+          <w:sz w:val="20"/>
+          <w:rFonts w:ascii="Times New Roman" w:hAnsi="Times New Roman" w:cs="Times New Roman"/>
+        </w:rPr>
+        <w:t>Arquitecté y construí landing pages estáticas con Astro 6 (SSG) para digitalizar la presentación de dos proyectos inmobiliarios (anteriormente distribuidos en archivos PDF desorganizados), mejorando drásticamente el posicionamiento SEO y logrando tiempos de carga de página por debajo de un segundo.</w:t>
+      </w:r>
+    </w:p>
+    <w:p>
+      <w:pPr>
+        <w:pStyle w:val="ListBullet"/>
+        <w:spacing w:before="20" w:after="20"/>
+        <w:ind w:left="360"/>
+      </w:pPr>
+      <w:r>
+        <w:rPr>
+          <w:rFonts w:ascii="Times New Roman" w:hAnsi="Times New Roman"/>
+          <w:b w:val="0"/>
+          <w:i w:val="0"/>
+          <w:sz w:val="20"/>
+          <w:rFonts w:ascii="Times New Roman" w:hAnsi="Times New Roman" w:cs="Times New Roman"/>
+        </w:rPr>
+        <w:t>Construí interfaces inmersivas mediante mapas interactivos 3D y animaciones al hacer scroll, sincronizando datos dinámicos vía API de Google Sheets para visualizar el inventario de 180+ unidades en tiempo real.</w:t>
+      </w:r>
+    </w:p>
+    <w:p>
+      <w:pPr>
+        <w:pStyle w:val="ListBullet"/>
+        <w:spacing w:before="20" w:after="20"/>
+        <w:ind w:left="360"/>
+      </w:pPr>
+      <w:r>
+        <w:rPr>
+          <w:rFonts w:ascii="Times New Roman" w:hAnsi="Times New Roman"/>
+          <w:b w:val="0"/>
+          <w:i w:val="0"/>
+          <w:sz w:val="20"/>
+          <w:rFonts w:ascii="Times New Roman" w:hAnsi="Times New Roman" w:cs="Times New Roman"/>
+        </w:rPr>
+        <w:t>Configuré pipelines de CI/CD automatizados con GitHub Actions para rebuilds programados cada 12 horas, y despliegue a dominio personalizado.</w:t>
       </w:r>
     </w:p>
     <w:p>
@@ -471,8 +535,9 @@
           <w:b/>
           <w:i w:val="0"/>
           <w:sz w:val="21"/>
+          <w:rFonts w:ascii="Times New Roman" w:hAnsi="Times New Roman" w:cs="Times New Roman"/>
         </w:rPr>
-        <w:t>Koa Towers y Aldea Savia — Plataformas Inmobiliarias Interactivas</w:t>
+        <w:t>Pocky — Mascota Virtual PWA Multiplataforma</w:t>
       </w:r>
       <w:r>
         <w:rPr>
@@ -481,91 +546,43 @@
           <w:i/>
           <w:color w:val="555555"/>
           <w:sz w:val="19"/>
+          <w:rFonts w:ascii="Times New Roman" w:hAnsi="Times New Roman" w:cs="Times New Roman"/>
         </w:rPr>
-        <w:t xml:space="preserve"> — Onix Living</w:t>
-      </w:r>
-      <w:r>
-        <w:rPr>
-          <w:rFonts w:ascii="Times New Roman" w:hAnsi="Times New Roman"/>
-          <w:b w:val="0"/>
-          <w:i/>
-          <w:color w:val="555555"/>
-          <w:sz w:val="19"/>
-        </w:rPr>
-        <w:tab/>
-        <w:t>2025</w:t>
+        <w:t xml:space="preserve"> — Personal</w:t>
       </w:r>
     </w:p>
     <w:p>
       <w:pPr>
-        <w:spacing w:after="20" w:before="0"/>
-        <w:ind w:left="360" w:hanging="216"/>
+        <w:pStyle w:val="ListBullet"/>
+        <w:spacing w:before="20" w:after="20"/>
+        <w:ind w:left="360"/>
       </w:pPr>
       <w:r>
         <w:rPr>
           <w:rFonts w:ascii="Times New Roman" w:hAnsi="Times New Roman"/>
           <w:b w:val="0"/>
           <w:i w:val="0"/>
-          <w:sz w:val="18"/>
+          <w:sz w:val="20"/>
+          <w:rFonts w:ascii="Times New Roman" w:hAnsi="Times New Roman" w:cs="Times New Roman"/>
         </w:rPr>
-        <w:t xml:space="preserve">• </w:t>
-      </w:r>
-      <w:r>
-        <w:rPr>
-          <w:rFonts w:ascii="Times New Roman" w:hAnsi="Times New Roman"/>
-          <w:b w:val="0"/>
-          <w:i w:val="0"/>
-          <w:sz w:val="19"/>
-        </w:rPr>
-        <w:t>Arquitecté y construií landing pages estáticas con Astro 6 SSG para dos proyectos inmobiliarios residenciales, optimizando SEO y cargas de página por debajo de un segundo.</w:t>
+        <w:t>Desarrollé una aplicación de mascota virtual compartida con sincronización en tiempo real vía Firebase a través de iOS (Safari PWA) y Android (Capacitor) sin distribución por App Store ni Google Play.</w:t>
       </w:r>
     </w:p>
     <w:p>
       <w:pPr>
-        <w:spacing w:after="20" w:before="0"/>
-        <w:ind w:left="360" w:hanging="216"/>
+        <w:pStyle w:val="ListBullet"/>
+        <w:spacing w:before="20" w:after="20"/>
+        <w:ind w:left="360"/>
       </w:pPr>
       <w:r>
         <w:rPr>
           <w:rFonts w:ascii="Times New Roman" w:hAnsi="Times New Roman"/>
           <w:b w:val="0"/>
           <w:i w:val="0"/>
-          <w:sz w:val="18"/>
+          <w:sz w:val="20"/>
+          <w:rFonts w:ascii="Times New Roman" w:hAnsi="Times New Roman" w:cs="Times New Roman"/>
         </w:rPr>
-        <w:t xml:space="preserve">• </w:t>
-      </w:r>
-      <w:r>
-        <w:rPr>
-          <w:rFonts w:ascii="Times New Roman" w:hAnsi="Times New Roman"/>
-          <w:b w:val="0"/>
-          <w:i w:val="0"/>
-          <w:sz w:val="19"/>
-        </w:rPr>
-        <w:t>Desarrollé mapas interactivos de disponibilidad con Google Maps API y datos dinámicos de unidades provenientes de Google Sheets API, permitiendo visualización de inventario en tiempo real para 180+ unidades residenciales.</w:t>
-      </w:r>
-    </w:p>
-    <w:p>
-      <w:pPr>
-        <w:spacing w:after="20" w:before="0"/>
-        <w:ind w:left="360" w:hanging="216"/>
-      </w:pPr>
-      <w:r>
-        <w:rPr>
-          <w:rFonts w:ascii="Times New Roman" w:hAnsi="Times New Roman"/>
-          <w:b w:val="0"/>
-          <w:i w:val="0"/>
-          <w:sz w:val="18"/>
-        </w:rPr>
-        <w:t xml:space="preserve">• </w:t>
-      </w:r>
-      <w:r>
-        <w:rPr>
-          <w:rFonts w:ascii="Times New Roman" w:hAnsi="Times New Roman"/>
-          <w:b w:val="0"/>
-          <w:i w:val="0"/>
-          <w:sz w:val="19"/>
-        </w:rPr>
-        <w:t>Configuré pipelines de CI/CD automatizados con GitHub Actions para rebuilds programados cada 12 horas, y despliegue a dominio personalizado (aldeasavia.onixliving.mx).</w:t>
+        <w:t>Implementé sistema de degradación 24/7 de la mascota, personajes animados y notificaciones Web Push para engagement multiplataforma.</w:t>
       </w:r>
     </w:p>
     <w:p>
@@ -578,88 +595,7 @@
           <w:b/>
           <w:i w:val="0"/>
           <w:sz w:val="21"/>
-        </w:rPr>
-        <w:t>Pocky — Mascota Virtual PWA Multiplataforma</w:t>
-      </w:r>
-      <w:r>
-        <w:rPr>
-          <w:rFonts w:ascii="Times New Roman" w:hAnsi="Times New Roman"/>
-          <w:b w:val="0"/>
-          <w:i/>
-          <w:color w:val="555555"/>
-          <w:sz w:val="19"/>
-        </w:rPr>
-        <w:t xml:space="preserve"> — Personal</w:t>
-      </w:r>
-      <w:r>
-        <w:rPr>
-          <w:rFonts w:ascii="Times New Roman" w:hAnsi="Times New Roman"/>
-          <w:b w:val="0"/>
-          <w:i/>
-          <w:color w:val="555555"/>
-          <w:sz w:val="19"/>
-        </w:rPr>
-        <w:tab/>
-      </w:r>
-    </w:p>
-    <w:p>
-      <w:pPr>
-        <w:spacing w:after="20" w:before="0"/>
-        <w:ind w:left="360" w:hanging="216"/>
-      </w:pPr>
-      <w:r>
-        <w:rPr>
-          <w:rFonts w:ascii="Times New Roman" w:hAnsi="Times New Roman"/>
-          <w:b w:val="0"/>
-          <w:i w:val="0"/>
-          <w:sz w:val="18"/>
-        </w:rPr>
-        <w:t xml:space="preserve">• </w:t>
-      </w:r>
-      <w:r>
-        <w:rPr>
-          <w:rFonts w:ascii="Times New Roman" w:hAnsi="Times New Roman"/>
-          <w:b w:val="0"/>
-          <w:i w:val="0"/>
-          <w:sz w:val="19"/>
-        </w:rPr>
-        <w:t>Desarrollé una aplicación de mascota virtual compartida con sincronización en tiempo real vía Firebase a través de iOS (Safari PWA) y Android (Capacitor) sin distribución por App Store ni Google Play.</w:t>
-      </w:r>
-    </w:p>
-    <w:p>
-      <w:pPr>
-        <w:spacing w:after="20" w:before="0"/>
-        <w:ind w:left="360" w:hanging="216"/>
-      </w:pPr>
-      <w:r>
-        <w:rPr>
-          <w:rFonts w:ascii="Times New Roman" w:hAnsi="Times New Roman"/>
-          <w:b w:val="0"/>
-          <w:i w:val="0"/>
-          <w:sz w:val="18"/>
-        </w:rPr>
-        <w:t xml:space="preserve">• </w:t>
-      </w:r>
-      <w:r>
-        <w:rPr>
-          <w:rFonts w:ascii="Times New Roman" w:hAnsi="Times New Roman"/>
-          <w:b w:val="0"/>
-          <w:i w:val="0"/>
-          <w:sz w:val="19"/>
-        </w:rPr>
-        <w:t>Implementé sistema de degradación 24/7 de la mascota, personajes animados en ASCII art y notificaciones Web Push para engagement multiplataforma.</w:t>
-      </w:r>
-    </w:p>
-    <w:p>
-      <w:pPr>
-        <w:spacing w:before="120" w:after="0"/>
-      </w:pPr>
-      <w:r>
-        <w:rPr>
-          <w:rFonts w:ascii="Times New Roman" w:hAnsi="Times New Roman"/>
-          <w:b/>
-          <w:i w:val="0"/>
-          <w:sz w:val="21"/>
+          <w:rFonts w:ascii="Times New Roman" w:hAnsi="Times New Roman" w:cs="Times New Roman"/>
         </w:rPr>
         <w:t>Arquitectura de Microservicios — Docker + Kubernetes + Helm</w:t>
       </w:r>
@@ -670,132 +606,51 @@
           <w:i/>
           <w:color w:val="555555"/>
           <w:sz w:val="19"/>
+          <w:rFonts w:ascii="Times New Roman" w:hAnsi="Times New Roman" w:cs="Times New Roman"/>
         </w:rPr>
         <w:t xml:space="preserve"> — Académico</w:t>
-      </w:r>
-      <w:r>
-        <w:rPr>
-          <w:rFonts w:ascii="Times New Roman" w:hAnsi="Times New Roman"/>
-          <w:b w:val="0"/>
-          <w:i/>
-          <w:color w:val="555555"/>
-          <w:sz w:val="19"/>
-        </w:rPr>
-        <w:tab/>
       </w:r>
     </w:p>
     <w:p>
       <w:pPr>
-        <w:spacing w:after="20" w:before="0"/>
-        <w:ind w:left="360" w:hanging="216"/>
+        <w:pStyle w:val="ListBullet"/>
+        <w:spacing w:before="20" w:after="20"/>
+        <w:ind w:left="360"/>
       </w:pPr>
       <w:r>
         <w:rPr>
           <w:rFonts w:ascii="Times New Roman" w:hAnsi="Times New Roman"/>
           <w:b w:val="0"/>
           <w:i w:val="0"/>
-          <w:sz w:val="18"/>
-        </w:rPr>
-        <w:t xml:space="preserve">• </w:t>
-      </w:r>
-      <w:r>
-        <w:rPr>
-          <w:rFonts w:ascii="Times New Roman" w:hAnsi="Times New Roman"/>
-          <w:b w:val="0"/>
-          <w:i w:val="0"/>
-          <w:sz w:val="19"/>
+          <w:sz w:val="20"/>
+          <w:rFonts w:ascii="Times New Roman" w:hAnsi="Times New Roman" w:cs="Times New Roman"/>
         </w:rPr>
         <w:t>Diseñé un stack completo de microservicios con backend Node.js, frontend con reverse-proxy nginx y base de datos MySQL.</w:t>
       </w:r>
     </w:p>
     <w:p>
       <w:pPr>
-        <w:spacing w:after="20" w:before="0"/>
-        <w:ind w:left="360" w:hanging="216"/>
+        <w:pStyle w:val="ListBullet"/>
+        <w:spacing w:before="20" w:after="20"/>
+        <w:ind w:left="360"/>
       </w:pPr>
       <w:r>
         <w:rPr>
           <w:rFonts w:ascii="Times New Roman" w:hAnsi="Times New Roman"/>
           <w:b w:val="0"/>
           <w:i w:val="0"/>
-          <w:sz w:val="18"/>
-        </w:rPr>
-        <w:t xml:space="preserve">• </w:t>
-      </w:r>
-      <w:r>
-        <w:rPr>
-          <w:rFonts w:ascii="Times New Roman" w:hAnsi="Times New Roman"/>
-          <w:b w:val="0"/>
-          <w:i w:val="0"/>
-          <w:sz w:val="19"/>
+          <w:sz w:val="20"/>
+          <w:rFonts w:ascii="Times New Roman" w:hAnsi="Times New Roman" w:cs="Times New Roman"/>
         </w:rPr>
         <w:t>Configuré despliegues en Kubernetes mediante Helm charts (Secrets, ConfigMaps, PVCs, Services) y automaticé pipeline CI/CD con GitHub Actions para publicación en Docker Hub.</w:t>
       </w:r>
     </w:p>
     <w:p>
       <w:pPr>
-        <w:spacing w:before="120" w:after="0"/>
-      </w:pPr>
-      <w:r>
-        <w:rPr>
-          <w:rFonts w:ascii="Times New Roman" w:hAnsi="Times New Roman"/>
-          <w:b/>
-          <w:i w:val="0"/>
-          <w:sz w:val="21"/>
-        </w:rPr>
-        <w:t>OnixDashTI — Dashboard Interno de TI</w:t>
-      </w:r>
-      <w:r>
-        <w:rPr>
-          <w:rFonts w:ascii="Times New Roman" w:hAnsi="Times New Roman"/>
-          <w:b w:val="0"/>
-          <w:i/>
-          <w:color w:val="555555"/>
-          <w:sz w:val="19"/>
-        </w:rPr>
-        <w:t xml:space="preserve"> — Onix Living</w:t>
-      </w:r>
-      <w:r>
-        <w:rPr>
-          <w:rFonts w:ascii="Times New Roman" w:hAnsi="Times New Roman"/>
-          <w:b w:val="0"/>
-          <w:i/>
-          <w:color w:val="555555"/>
-          <w:sz w:val="19"/>
-        </w:rPr>
-        <w:tab/>
-      </w:r>
-    </w:p>
-    <w:p>
-      <w:pPr>
-        <w:spacing w:after="20" w:before="0"/>
-        <w:ind w:left="360" w:hanging="216"/>
-      </w:pPr>
-      <w:r>
-        <w:rPr>
-          <w:rFonts w:ascii="Times New Roman" w:hAnsi="Times New Roman"/>
-          <w:b w:val="0"/>
-          <w:i w:val="0"/>
-          <w:sz w:val="18"/>
-        </w:rPr>
-        <w:t xml:space="preserve">• </w:t>
-      </w:r>
-      <w:r>
-        <w:rPr>
-          <w:rFonts w:ascii="Times New Roman" w:hAnsi="Times New Roman"/>
-          <w:b w:val="0"/>
-          <w:i w:val="0"/>
-          <w:sz w:val="19"/>
-        </w:rPr>
-        <w:t>Creé un dashboard drag-and-drop para visualización de datos de operaciones de TI usando Gridstack; containericé con Docker Compose y desplegué en red interna.</w:t>
-      </w:r>
-    </w:p>
-    <w:p>
-      <w:pPr>
-        <w:spacing w:before="200" w:after="60"/>
         <w:pBdr>
           <w:bottom w:val="single" w:sz="12" w:space="1" w:color="1A1A1A"/>
         </w:pBdr>
+        <w:spacing w:before="240" w:after="80"/>
       </w:pPr>
       <w:r>
         <w:rPr>
@@ -803,20 +658,47 @@
           <w:b/>
           <w:i w:val="0"/>
           <w:sz w:val="22"/>
+          <w:rFonts w:ascii="Times New Roman" w:hAnsi="Times New Roman" w:cs="Times New Roman"/>
         </w:rPr>
         <w:t>HABILIDADES</w:t>
       </w:r>
     </w:p>
     <w:p>
       <w:pPr>
-        <w:spacing w:after="0" w:before="0"/>
+        <w:spacing w:before="20" w:after="20"/>
       </w:pPr>
       <w:r>
         <w:rPr>
           <w:rFonts w:ascii="Times New Roman" w:hAnsi="Times New Roman"/>
           <w:b/>
           <w:i w:val="0"/>
-          <w:sz w:val="21"/>
+          <w:sz w:val="20"/>
+          <w:rFonts w:ascii="Times New Roman" w:hAnsi="Times New Roman" w:cs="Times New Roman"/>
+        </w:rPr>
+        <w:t>Frontend:</w:t>
+      </w:r>
+      <w:r>
+        <w:rPr>
+          <w:rFonts w:ascii="Times New Roman" w:hAnsi="Times New Roman"/>
+          <w:b w:val="0"/>
+          <w:i w:val="0"/>
+          <w:sz w:val="20"/>
+          <w:rFonts w:ascii="Times New Roman" w:hAnsi="Times New Roman" w:cs="Times New Roman"/>
+        </w:rPr>
+        <w:t>Next.js, React, Astro, Vue 3, Tailwind CSS, Framer Motion, Swiper</w:t>
+      </w:r>
+    </w:p>
+    <w:p>
+      <w:pPr>
+        <w:spacing w:before="20" w:after="20"/>
+      </w:pPr>
+      <w:r>
+        <w:rPr>
+          <w:rFonts w:ascii="Times New Roman" w:hAnsi="Times New Roman"/>
+          <w:b/>
+          <w:i w:val="0"/>
+          <w:sz w:val="20"/>
+          <w:rFonts w:ascii="Times New Roman" w:hAnsi="Times New Roman" w:cs="Times New Roman"/>
         </w:rPr>
         <w:t>Lenguajes:</w:t>
       </w:r>
@@ -825,46 +707,23 @@
           <w:rFonts w:ascii="Times New Roman" w:hAnsi="Times New Roman"/>
           <w:b w:val="0"/>
           <w:i w:val="0"/>
-          <w:sz w:val="21"/>
+          <w:sz w:val="20"/>
+          <w:rFonts w:ascii="Times New Roman" w:hAnsi="Times New Roman" w:cs="Times New Roman"/>
         </w:rPr>
-        <w:tab/>
         <w:t>JavaScript, TypeScript, HTML5, CSS3, Java, PHP, SQL</w:t>
       </w:r>
     </w:p>
     <w:p>
       <w:pPr>
-        <w:spacing w:after="0" w:before="0"/>
+        <w:spacing w:before="20" w:after="20"/>
       </w:pPr>
       <w:r>
         <w:rPr>
           <w:rFonts w:ascii="Times New Roman" w:hAnsi="Times New Roman"/>
           <w:b/>
           <w:i w:val="0"/>
-          <w:sz w:val="21"/>
-        </w:rPr>
-        <w:t>Frontend:</w:t>
-      </w:r>
-      <w:r>
-        <w:rPr>
-          <w:rFonts w:ascii="Times New Roman" w:hAnsi="Times New Roman"/>
-          <w:b w:val="0"/>
-          <w:i w:val="0"/>
-          <w:sz w:val="21"/>
-        </w:rPr>
-        <w:tab/>
-        <w:t>Astro, Next.js, React, Vue 3, Tailwind CSS, Framer Motion, Swiper</w:t>
-      </w:r>
-    </w:p>
-    <w:p>
-      <w:pPr>
-        <w:spacing w:after="0" w:before="0"/>
-      </w:pPr>
-      <w:r>
-        <w:rPr>
-          <w:rFonts w:ascii="Times New Roman" w:hAnsi="Times New Roman"/>
-          <w:b/>
-          <w:i w:val="0"/>
-          <w:sz w:val="21"/>
+          <w:sz w:val="20"/>
+          <w:rFonts w:ascii="Times New Roman" w:hAnsi="Times New Roman" w:cs="Times New Roman"/>
         </w:rPr>
         <w:t>Backend:</w:t>
       </w:r>
@@ -873,70 +732,48 @@
           <w:rFonts w:ascii="Times New Roman" w:hAnsi="Times New Roman"/>
           <w:b w:val="0"/>
           <w:i w:val="0"/>
-          <w:sz w:val="21"/>
+          <w:sz w:val="20"/>
+          <w:rFonts w:ascii="Times New Roman" w:hAnsi="Times New Roman" w:cs="Times New Roman"/>
         </w:rPr>
-        <w:tab/>
         <w:t>Node.js, Spring Boot, Laravel</w:t>
       </w:r>
     </w:p>
     <w:p>
       <w:pPr>
-        <w:spacing w:after="0" w:before="0"/>
+        <w:spacing w:before="20" w:after="20"/>
       </w:pPr>
       <w:r>
         <w:rPr>
           <w:rFonts w:ascii="Times New Roman" w:hAnsi="Times New Roman"/>
           <w:b/>
           <w:i w:val="0"/>
-          <w:sz w:val="21"/>
+          <w:sz w:val="20"/>
+          <w:rFonts w:ascii="Times New Roman" w:hAnsi="Times New Roman" w:cs="Times New Roman"/>
         </w:rPr>
-        <w:t>Infraestructura:</w:t>
+        <w:t>Infraestructura y BD:</w:t>
       </w:r>
       <w:r>
         <w:rPr>
           <w:rFonts w:ascii="Times New Roman" w:hAnsi="Times New Roman"/>
           <w:b w:val="0"/>
           <w:i w:val="0"/>
-          <w:sz w:val="21"/>
+          <w:sz w:val="20"/>
+          <w:rFonts w:ascii="Times New Roman" w:hAnsi="Times New Roman" w:cs="Times New Roman"/>
         </w:rPr>
-        <w:tab/>
-        <w:t>AWS, Amazon S3, Docker, Kubernetes, Helm, GitHub Actions</w:t>
+        <w:t>AWS, Amazon S3, Docker, Kubernetes, Helm, GitHub Actions, MySQL</w:t>
       </w:r>
     </w:p>
     <w:p>
       <w:pPr>
-        <w:spacing w:after="0" w:before="0"/>
+        <w:spacing w:before="20" w:after="20"/>
       </w:pPr>
       <w:r>
         <w:rPr>
           <w:rFonts w:ascii="Times New Roman" w:hAnsi="Times New Roman"/>
           <w:b/>
           <w:i w:val="0"/>
-          <w:sz w:val="21"/>
-        </w:rPr>
-        <w:t>Bases de datos:</w:t>
-      </w:r>
-      <w:r>
-        <w:rPr>
-          <w:rFonts w:ascii="Times New Roman" w:hAnsi="Times New Roman"/>
-          <w:b w:val="0"/>
-          <w:i w:val="0"/>
-          <w:sz w:val="21"/>
-        </w:rPr>
-        <w:tab/>
-        <w:t>MySQL</w:t>
-      </w:r>
-    </w:p>
-    <w:p>
-      <w:pPr>
-        <w:spacing w:after="0" w:before="0"/>
-      </w:pPr>
-      <w:r>
-        <w:rPr>
-          <w:rFonts w:ascii="Times New Roman" w:hAnsi="Times New Roman"/>
-          <w:b/>
-          <w:i w:val="0"/>
-          <w:sz w:val="21"/>
+          <w:sz w:val="20"/>
+          <w:rFonts w:ascii="Times New Roman" w:hAnsi="Times New Roman" w:cs="Times New Roman"/>
         </w:rPr>
         <w:t>Otros:</w:t>
       </w:r>
@@ -945,18 +782,18 @@
           <w:rFonts w:ascii="Times New Roman" w:hAnsi="Times New Roman"/>
           <w:b w:val="0"/>
           <w:i w:val="0"/>
-          <w:sz w:val="21"/>
+          <w:sz w:val="20"/>
+          <w:rFonts w:ascii="Times New Roman" w:hAnsi="Times New Roman" w:cs="Times New Roman"/>
         </w:rPr>
-        <w:tab/>
         <w:t>Firebase (Realtime, Admin), PWA, Capacitor, Git, Snipe-IT, Figma</w:t>
       </w:r>
     </w:p>
     <w:p>
       <w:pPr>
-        <w:spacing w:before="200" w:after="60"/>
         <w:pBdr>
           <w:bottom w:val="single" w:sz="12" w:space="1" w:color="1A1A1A"/>
         </w:pBdr>
+        <w:spacing w:before="240" w:after="80"/>
       </w:pPr>
       <w:r>
         <w:rPr>
@@ -964,317 +801,176 @@
           <w:b/>
           <w:i w:val="0"/>
           <w:sz w:val="22"/>
+          <w:rFonts w:ascii="Times New Roman" w:hAnsi="Times New Roman" w:cs="Times New Roman"/>
         </w:rPr>
         <w:t>CERTIFICACIONES</w:t>
       </w:r>
     </w:p>
-    <w:tbl>
-      <w:tblPr>
-        <w:tblW w:type="auto" w:w="0"/>
-        <w:jc w:val="center"/>
-        <w:tblLook w:firstColumn="1" w:firstRow="1" w:lastColumn="0" w:lastRow="0" w:noHBand="0" w:noVBand="1" w:val="04A0"/>
-      </w:tblPr>
-      <w:tblGrid>
-        <w:gridCol w:w="5112"/>
-        <w:gridCol w:w="5112"/>
-      </w:tblGrid>
-      <w:tr>
-        <w:tc>
-          <w:tcPr>
-            <w:tcW w:type="dxa" w:w="5112"/>
-            <w:tcBorders>
-              <w:top w:val="none" w:sz="0" w:space="0" w:color="auto"/>
-              <w:left w:val="none" w:sz="0" w:space="0" w:color="auto"/>
-              <w:bottom w:val="none" w:sz="0" w:space="0" w:color="auto"/>
-              <w:right w:val="none" w:sz="0" w:space="0" w:color="auto"/>
-              <w:insideH w:val="none" w:sz="0" w:space="0" w:color="auto"/>
-              <w:insideV w:val="none" w:sz="0" w:space="0" w:color="auto"/>
-            </w:tcBorders>
-          </w:tcPr>
-          <w:p>
-            <w:pPr>
-              <w:spacing w:before="0" w:after="20"/>
-            </w:pPr>
-            <w:r>
-              <w:rPr>
-                <w:rFonts w:ascii="Times New Roman" w:hAnsi="Times New Roman"/>
-                <w:b/>
-                <w:i w:val="0"/>
-                <w:sz w:val="19"/>
-              </w:rPr>
-              <w:t>Big Data 101</w:t>
-            </w:r>
-            <w:r>
-              <w:rPr>
-                <w:rFonts w:ascii="Times New Roman" w:hAnsi="Times New Roman"/>
-                <w:b w:val="0"/>
-                <w:i w:val="0"/>
-                <w:sz w:val="19"/>
-              </w:rPr>
-              <w:t xml:space="preserve"> — Cognitive Class (IBM), Abr 2026</w:t>
-            </w:r>
-          </w:p>
-        </w:tc>
-        <w:tc>
-          <w:tcPr>
-            <w:tcW w:type="dxa" w:w="5112"/>
-            <w:tcBorders>
-              <w:top w:val="none" w:sz="0" w:space="0" w:color="auto"/>
-              <w:left w:val="none" w:sz="0" w:space="0" w:color="auto"/>
-              <w:bottom w:val="none" w:sz="0" w:space="0" w:color="auto"/>
-              <w:right w:val="none" w:sz="0" w:space="0" w:color="auto"/>
-              <w:insideH w:val="none" w:sz="0" w:space="0" w:color="auto"/>
-              <w:insideV w:val="none" w:sz="0" w:space="0" w:color="auto"/>
-            </w:tcBorders>
-          </w:tcPr>
-          <w:p>
-            <w:pPr>
-              <w:spacing w:before="0" w:after="20"/>
-            </w:pPr>
-            <w:r>
-              <w:rPr>
-                <w:rFonts w:ascii="Times New Roman" w:hAnsi="Times New Roman"/>
-                <w:b/>
-                <w:i w:val="0"/>
-                <w:sz w:val="19"/>
-              </w:rPr>
-              <w:t>Big Data Foundations L1 &amp; L2</w:t>
-            </w:r>
-            <w:r>
-              <w:rPr>
-                <w:rFonts w:ascii="Times New Roman" w:hAnsi="Times New Roman"/>
-                <w:b w:val="0"/>
-                <w:i w:val="0"/>
-                <w:sz w:val="19"/>
-              </w:rPr>
-              <w:t xml:space="preserve"> — IBM, Abr 2026</w:t>
-            </w:r>
-          </w:p>
-        </w:tc>
-      </w:tr>
-      <w:tr>
-        <w:tc>
-          <w:tcPr>
-            <w:tcW w:type="dxa" w:w="5112"/>
-            <w:tcBorders>
-              <w:top w:val="none" w:sz="0" w:space="0" w:color="auto"/>
-              <w:left w:val="none" w:sz="0" w:space="0" w:color="auto"/>
-              <w:bottom w:val="none" w:sz="0" w:space="0" w:color="auto"/>
-              <w:right w:val="none" w:sz="0" w:space="0" w:color="auto"/>
-              <w:insideH w:val="none" w:sz="0" w:space="0" w:color="auto"/>
-              <w:insideV w:val="none" w:sz="0" w:space="0" w:color="auto"/>
-            </w:tcBorders>
-          </w:tcPr>
-          <w:p>
-            <w:pPr>
-              <w:spacing w:before="0" w:after="20"/>
-            </w:pPr>
-            <w:r>
-              <w:rPr>
-                <w:rFonts w:ascii="Times New Roman" w:hAnsi="Times New Roman"/>
-                <w:b/>
-                <w:i w:val="0"/>
-                <w:sz w:val="19"/>
-              </w:rPr>
-              <w:t>Spark — Level 1</w:t>
-            </w:r>
-            <w:r>
-              <w:rPr>
-                <w:rFonts w:ascii="Times New Roman" w:hAnsi="Times New Roman"/>
-                <w:b w:val="0"/>
-                <w:i w:val="0"/>
-                <w:sz w:val="19"/>
-              </w:rPr>
-              <w:t xml:space="preserve"> — IBM, Abr 2026</w:t>
-            </w:r>
-          </w:p>
-        </w:tc>
-        <w:tc>
-          <w:tcPr>
-            <w:tcW w:type="dxa" w:w="5112"/>
-            <w:tcBorders>
-              <w:top w:val="none" w:sz="0" w:space="0" w:color="auto"/>
-              <w:left w:val="none" w:sz="0" w:space="0" w:color="auto"/>
-              <w:bottom w:val="none" w:sz="0" w:space="0" w:color="auto"/>
-              <w:right w:val="none" w:sz="0" w:space="0" w:color="auto"/>
-              <w:insideH w:val="none" w:sz="0" w:space="0" w:color="auto"/>
-              <w:insideV w:val="none" w:sz="0" w:space="0" w:color="auto"/>
-            </w:tcBorders>
-          </w:tcPr>
-          <w:p>
-            <w:pPr>
-              <w:spacing w:before="0" w:after="20"/>
-            </w:pPr>
-            <w:r>
-              <w:rPr>
-                <w:rFonts w:ascii="Times New Roman" w:hAnsi="Times New Roman"/>
-                <w:b/>
-                <w:i w:val="0"/>
-                <w:sz w:val="19"/>
-              </w:rPr>
-              <w:t>Hadoop Foundations — Level 1</w:t>
-            </w:r>
-            <w:r>
-              <w:rPr>
-                <w:rFonts w:ascii="Times New Roman" w:hAnsi="Times New Roman"/>
-                <w:b w:val="0"/>
-                <w:i w:val="0"/>
-                <w:sz w:val="19"/>
-              </w:rPr>
-              <w:t xml:space="preserve"> — IBM, Abr 2026</w:t>
-            </w:r>
-          </w:p>
-        </w:tc>
-      </w:tr>
-      <w:tr>
-        <w:tc>
-          <w:tcPr>
-            <w:tcW w:type="dxa" w:w="5112"/>
-            <w:tcBorders>
-              <w:top w:val="none" w:sz="0" w:space="0" w:color="auto"/>
-              <w:left w:val="none" w:sz="0" w:space="0" w:color="auto"/>
-              <w:bottom w:val="none" w:sz="0" w:space="0" w:color="auto"/>
-              <w:right w:val="none" w:sz="0" w:space="0" w:color="auto"/>
-              <w:insideH w:val="none" w:sz="0" w:space="0" w:color="auto"/>
-              <w:insideV w:val="none" w:sz="0" w:space="0" w:color="auto"/>
-            </w:tcBorders>
-          </w:tcPr>
-          <w:p>
-            <w:pPr>
-              <w:spacing w:before="0" w:after="20"/>
-            </w:pPr>
-            <w:r>
-              <w:rPr>
-                <w:rFonts w:ascii="Times New Roman" w:hAnsi="Times New Roman"/>
-                <w:b/>
-                <w:i w:val="0"/>
-                <w:sz w:val="19"/>
-              </w:rPr>
-              <w:t>AWS Academy Graduate — Data Engineering</w:t>
-            </w:r>
-            <w:r>
-              <w:rPr>
-                <w:rFonts w:ascii="Times New Roman" w:hAnsi="Times New Roman"/>
-                <w:b w:val="0"/>
-                <w:i w:val="0"/>
-                <w:sz w:val="19"/>
-              </w:rPr>
-              <w:t xml:space="preserve"> — AWS, Dic 2025</w:t>
-            </w:r>
-          </w:p>
-        </w:tc>
-        <w:tc>
-          <w:tcPr>
-            <w:tcW w:type="dxa" w:w="5112"/>
-            <w:tcBorders>
-              <w:top w:val="none" w:sz="0" w:space="0" w:color="auto"/>
-              <w:left w:val="none" w:sz="0" w:space="0" w:color="auto"/>
-              <w:bottom w:val="none" w:sz="0" w:space="0" w:color="auto"/>
-              <w:right w:val="none" w:sz="0" w:space="0" w:color="auto"/>
-              <w:insideH w:val="none" w:sz="0" w:space="0" w:color="auto"/>
-              <w:insideV w:val="none" w:sz="0" w:space="0" w:color="auto"/>
-            </w:tcBorders>
-          </w:tcPr>
-          <w:p>
-            <w:pPr>
-              <w:spacing w:before="0" w:after="20"/>
-            </w:pPr>
-            <w:r>
-              <w:rPr>
-                <w:rFonts w:ascii="Times New Roman" w:hAnsi="Times New Roman"/>
-                <w:b/>
-                <w:i w:val="0"/>
-                <w:sz w:val="19"/>
-              </w:rPr>
-              <w:t>EF SET English — C1 Advanced (67/100)</w:t>
-            </w:r>
-            <w:r>
-              <w:rPr>
-                <w:rFonts w:ascii="Times New Roman" w:hAnsi="Times New Roman"/>
-                <w:b w:val="0"/>
-                <w:i w:val="0"/>
-                <w:sz w:val="19"/>
-              </w:rPr>
-              <w:t xml:space="preserve"> — EF SET, Jul 2025</w:t>
-            </w:r>
-          </w:p>
-        </w:tc>
-      </w:tr>
-      <w:tr>
-        <w:tc>
-          <w:tcPr>
-            <w:tcW w:type="dxa" w:w="5112"/>
-            <w:tcBorders>
-              <w:top w:val="none" w:sz="0" w:space="0" w:color="auto"/>
-              <w:left w:val="none" w:sz="0" w:space="0" w:color="auto"/>
-              <w:bottom w:val="none" w:sz="0" w:space="0" w:color="auto"/>
-              <w:right w:val="none" w:sz="0" w:space="0" w:color="auto"/>
-              <w:insideH w:val="none" w:sz="0" w:space="0" w:color="auto"/>
-              <w:insideV w:val="none" w:sz="0" w:space="0" w:color="auto"/>
-            </w:tcBorders>
-          </w:tcPr>
-          <w:p>
-            <w:pPr>
-              <w:spacing w:before="0" w:after="20"/>
-            </w:pPr>
-            <w:r>
-              <w:rPr>
-                <w:rFonts w:ascii="Times New Roman" w:hAnsi="Times New Roman"/>
-                <w:b/>
-                <w:i w:val="0"/>
-                <w:sz w:val="19"/>
-              </w:rPr>
-              <w:t>Networking Academy Learn-A-Thon 2024</w:t>
-            </w:r>
-            <w:r>
-              <w:rPr>
-                <w:rFonts w:ascii="Times New Roman" w:hAnsi="Times New Roman"/>
-                <w:b w:val="0"/>
-                <w:i w:val="0"/>
-                <w:sz w:val="19"/>
-              </w:rPr>
-              <w:t xml:space="preserve"> — Cisco, Jun 2024</w:t>
-            </w:r>
-          </w:p>
-        </w:tc>
-        <w:tc>
-          <w:tcPr>
-            <w:tcW w:type="dxa" w:w="5112"/>
-            <w:tcBorders>
-              <w:top w:val="none" w:sz="0" w:space="0" w:color="auto"/>
-              <w:left w:val="none" w:sz="0" w:space="0" w:color="auto"/>
-              <w:bottom w:val="none" w:sz="0" w:space="0" w:color="auto"/>
-              <w:right w:val="none" w:sz="0" w:space="0" w:color="auto"/>
-              <w:insideH w:val="none" w:sz="0" w:space="0" w:color="auto"/>
-              <w:insideV w:val="none" w:sz="0" w:space="0" w:color="auto"/>
-            </w:tcBorders>
-          </w:tcPr>
-          <w:p>
-            <w:pPr>
-              <w:spacing w:before="0" w:after="20"/>
-            </w:pPr>
-            <w:r>
-              <w:rPr>
-                <w:rFonts w:ascii="Times New Roman" w:hAnsi="Times New Roman"/>
-                <w:b/>
-                <w:i w:val="0"/>
-                <w:sz w:val="19"/>
-              </w:rPr>
-              <w:t>Figma Avanzado</w:t>
-            </w:r>
-            <w:r>
-              <w:rPr>
-                <w:rFonts w:ascii="Times New Roman" w:hAnsi="Times New Roman"/>
-                <w:b w:val="0"/>
-                <w:i w:val="0"/>
-                <w:sz w:val="19"/>
-              </w:rPr>
-              <w:t xml:space="preserve"> — LinkedIn Learning</w:t>
-            </w:r>
-          </w:p>
-        </w:tc>
-      </w:tr>
-    </w:tbl>
+    <w:p>
+      <w:pPr>
+        <w:spacing w:before="20" w:after="20"/>
+      </w:pPr>
+      <w:r>
+        <w:rPr>
+          <w:rFonts w:ascii="Times New Roman" w:hAnsi="Times New Roman"/>
+          <w:b/>
+          <w:i w:val="0"/>
+          <w:sz w:val="19"/>
+          <w:rFonts w:ascii="Times New Roman" w:hAnsi="Times New Roman" w:cs="Times New Roman"/>
+        </w:rPr>
+        <w:t>EF SET English — C1 Advanced (67/100)</w:t>
+      </w:r>
+      <w:r>
+        <w:rPr>
+          <w:rFonts w:ascii="Times New Roman" w:hAnsi="Times New Roman"/>
+          <w:b w:val="0"/>
+          <w:i w:val="0"/>
+          <w:sz w:val="19"/>
+          <w:rFonts w:ascii="Times New Roman" w:hAnsi="Times New Roman" w:cs="Times New Roman"/>
+        </w:rPr>
+        <w:t xml:space="preserve"> — EF SET</w:t>
+      </w:r>
+      <w:r>
+        <w:rPr>
+          <w:rFonts w:ascii="Times New Roman" w:hAnsi="Times New Roman"/>
+          <w:b w:val="0"/>
+          <w:i w:val="0"/>
+          <w:sz w:val="19"/>
+          <w:rFonts w:ascii="Times New Roman" w:hAnsi="Times New Roman" w:cs="Times New Roman"/>
+        </w:rPr>
+        <w:t>, Jul 2025</w:t>
+      </w:r>
+    </w:p>
+    <w:p>
+      <w:pPr>
+        <w:spacing w:before="20" w:after="20"/>
+      </w:pPr>
+      <w:r>
+        <w:rPr>
+          <w:rFonts w:ascii="Times New Roman" w:hAnsi="Times New Roman"/>
+          <w:b/>
+          <w:i w:val="0"/>
+          <w:sz w:val="19"/>
+          <w:rFonts w:ascii="Times New Roman" w:hAnsi="Times New Roman" w:cs="Times New Roman"/>
+        </w:rPr>
+        <w:t>AWS Academy Graduate — Data Engineering</w:t>
+      </w:r>
+      <w:r>
+        <w:rPr>
+          <w:rFonts w:ascii="Times New Roman" w:hAnsi="Times New Roman"/>
+          <w:b w:val="0"/>
+          <w:i w:val="0"/>
+          <w:sz w:val="19"/>
+          <w:rFonts w:ascii="Times New Roman" w:hAnsi="Times New Roman" w:cs="Times New Roman"/>
+        </w:rPr>
+        <w:t xml:space="preserve"> — AWS</w:t>
+      </w:r>
+      <w:r>
+        <w:rPr>
+          <w:rFonts w:ascii="Times New Roman" w:hAnsi="Times New Roman"/>
+          <w:b w:val="0"/>
+          <w:i w:val="0"/>
+          <w:sz w:val="19"/>
+          <w:rFonts w:ascii="Times New Roman" w:hAnsi="Times New Roman" w:cs="Times New Roman"/>
+        </w:rPr>
+        <w:t>, Dic 2025</w:t>
+      </w:r>
+    </w:p>
+    <w:p>
+      <w:pPr>
+        <w:spacing w:before="20" w:after="20"/>
+      </w:pPr>
+      <w:r>
+        <w:rPr>
+          <w:rFonts w:ascii="Times New Roman" w:hAnsi="Times New Roman"/>
+          <w:b/>
+          <w:i w:val="0"/>
+          <w:sz w:val="19"/>
+          <w:rFonts w:ascii="Times New Roman" w:hAnsi="Times New Roman" w:cs="Times New Roman"/>
+        </w:rPr>
+        <w:t>Figma Avanzado</w:t>
+      </w:r>
+      <w:r>
+        <w:rPr>
+          <w:rFonts w:ascii="Times New Roman" w:hAnsi="Times New Roman"/>
+          <w:b w:val="0"/>
+          <w:i w:val="0"/>
+          <w:sz w:val="19"/>
+          <w:rFonts w:ascii="Times New Roman" w:hAnsi="Times New Roman" w:cs="Times New Roman"/>
+        </w:rPr>
+        <w:t xml:space="preserve"> — LinkedIn Learning</w:t>
+      </w:r>
+    </w:p>
+    <w:p>
+      <w:pPr>
+        <w:spacing w:before="20" w:after="20"/>
+      </w:pPr>
+      <w:r>
+        <w:rPr>
+          <w:rFonts w:ascii="Times New Roman" w:hAnsi="Times New Roman"/>
+          <w:b/>
+          <w:i w:val="0"/>
+          <w:sz w:val="19"/>
+          <w:rFonts w:ascii="Times New Roman" w:hAnsi="Times New Roman" w:cs="Times New Roman"/>
+        </w:rPr>
+        <w:t>Networking Academy Learn-A-Thon 2024</w:t>
+      </w:r>
+      <w:r>
+        <w:rPr>
+          <w:rFonts w:ascii="Times New Roman" w:hAnsi="Times New Roman"/>
+          <w:b w:val="0"/>
+          <w:i w:val="0"/>
+          <w:sz w:val="19"/>
+          <w:rFonts w:ascii="Times New Roman" w:hAnsi="Times New Roman" w:cs="Times New Roman"/>
+        </w:rPr>
+        <w:t xml:space="preserve"> — Cisco</w:t>
+      </w:r>
+      <w:r>
+        <w:rPr>
+          <w:rFonts w:ascii="Times New Roman" w:hAnsi="Times New Roman"/>
+          <w:b w:val="0"/>
+          <w:i w:val="0"/>
+          <w:sz w:val="19"/>
+          <w:rFonts w:ascii="Times New Roman" w:hAnsi="Times New Roman" w:cs="Times New Roman"/>
+        </w:rPr>
+        <w:t>, Jun 2024</w:t>
+      </w:r>
+    </w:p>
+    <w:p>
+      <w:pPr>
+        <w:spacing w:before="20" w:after="20"/>
+      </w:pPr>
+      <w:r>
+        <w:rPr>
+          <w:rFonts w:ascii="Times New Roman" w:hAnsi="Times New Roman"/>
+          <w:b/>
+          <w:i w:val="0"/>
+          <w:sz w:val="19"/>
+          <w:rFonts w:ascii="Times New Roman" w:hAnsi="Times New Roman" w:cs="Times New Roman"/>
+        </w:rPr>
+        <w:t>Big Data &amp; Hadoop Foundations (L1, L2, Spark)</w:t>
+      </w:r>
+      <w:r>
+        <w:rPr>
+          <w:rFonts w:ascii="Times New Roman" w:hAnsi="Times New Roman"/>
+          <w:b w:val="0"/>
+          <w:i w:val="0"/>
+          <w:sz w:val="19"/>
+          <w:rFonts w:ascii="Times New Roman" w:hAnsi="Times New Roman" w:cs="Times New Roman"/>
+        </w:rPr>
+        <w:t xml:space="preserve"> — IBM</w:t>
+      </w:r>
+      <w:r>
+        <w:rPr>
+          <w:rFonts w:ascii="Times New Roman" w:hAnsi="Times New Roman"/>
+          <w:b w:val="0"/>
+          <w:i w:val="0"/>
+          <w:sz w:val="19"/>
+          <w:rFonts w:ascii="Times New Roman" w:hAnsi="Times New Roman" w:cs="Times New Roman"/>
+        </w:rPr>
+        <w:t>, Abr 2026</w:t>
+      </w:r>
+    </w:p>
     <w:sectPr>
       <w:pgSz w:w="12240" w:h="15840"/>
       <w:pgMar w:top="864" w:right="1008" w:bottom="864" w:left="1008" w:header="720" w:footer="720" w:gutter="0"/>
@@ -1649,7 +1345,7 @@
     <w:qFormat/>
     <w:rsid w:val="00FC693F"/>
     <w:pPr>
-      <w:spacing w:after="0" w:before="0" w:line="276" w:lineRule="auto"/>
+      <w:spacing w:after="0" w:before="0"/>
     </w:pPr>
     <w:rPr>
       <w:rFonts w:ascii="Times New Roman" w:hAnsi="Times New Roman"/>
@@ -2184,6 +1880,9 @@
       </w:numPr>
       <w:contextualSpacing/>
     </w:pPr>
+    <w:rPr>
+      <w:sz w:val="20"/>
+    </w:rPr>
   </w:style>
   <w:style w:type="paragraph" w:styleId="ListBullet2">
     <w:name w:val="List Bullet 2"/>

</xml_diff>